<commit_message>
Fix the dojo contribution at JPY 20,000/month
Co-Authored-By: Claude Opus 5.5 <noreply@anthropic.com>
Claude-Session: https://claude.ai/code/session_01HEKohJVopG8W2cUXpo7Mmy
</commit_message>
<xml_diff>
--- a/docs/dojo/dojo-use-plan.docx
+++ b/docs/dojo/dojo-use-plan.docx
@@ -967,8 +967,6 @@
         <w:rPr>
           <w:b/>
           <w:bCs/>
-          <w:highlight w:val="yellow"/>
-          <w:highlightCs w:val="yellow"/>
         </w:rPr>
         <w:t xml:space="preserve">JPY 20,000 per month</w:t>
       </w:r>
@@ -1970,8 +1968,6 @@
         <w:rPr>
           <w:b/>
           <w:bCs/>
-          <w:highlight w:val="yellow"/>
-          <w:highlightCs w:val="yellow"/>
         </w:rPr>
         <w:t xml:space="preserve">月20,000円</w:t>
       </w:r>

</xml_diff>